<commit_message>
added more about probability calibration and added a rough acknowledgement
</commit_message>
<xml_diff>
--- a/Docs/FeedbackIn/Machine learning applied to otolith timeseries data to discriminate river of origin for Western Alaska Salmon.docx
+++ b/Docs/FeedbackIn/Machine learning applied to otolith timeseries data to discriminate river of origin for Western Alaska Salmon.docx
@@ -8149,7 +8149,39 @@
           <w:sz w:val="22"/>
           <w:szCs w:val="22"/>
         </w:rPr>
-        <w:t>probability estimates that do not accurately reflect the true likelihood of correct prediction</w:t>
+        <w:t xml:space="preserve">probability estimates that </w:t>
+      </w:r>
+      <w:r>
+        <w:rPr>
+          <w:rFonts w:ascii="Garamond" w:hAnsi="Garamond"/>
+          <w:sz w:val="22"/>
+          <w:szCs w:val="22"/>
+        </w:rPr>
+        <w:t>correctly identify rank class likelihood but produce estimated probability values that do</w:t>
+      </w:r>
+      <w:r>
+        <w:rPr>
+          <w:rFonts w:ascii="Garamond" w:hAnsi="Garamond"/>
+          <w:sz w:val="22"/>
+          <w:szCs w:val="22"/>
+        </w:rPr>
+        <w:t xml:space="preserve"> not accurately reflect true </w:t>
+      </w:r>
+      <w:r>
+        <w:rPr>
+          <w:rFonts w:ascii="Garamond" w:hAnsi="Garamond"/>
+          <w:sz w:val="22"/>
+          <w:szCs w:val="22"/>
+        </w:rPr>
+        <w:t xml:space="preserve">confidence </w:t>
+      </w:r>
+      <w:r>
+        <w:rPr>
+          <w:rFonts w:ascii="Garamond" w:hAnsi="Garamond"/>
+          <w:sz w:val="22"/>
+          <w:szCs w:val="22"/>
+        </w:rPr>
+        <w:t>of correct prediction</w:t>
       </w:r>
       <w:r>
         <w:rPr>
@@ -8214,55 +8246,7 @@
           <w:sz w:val="22"/>
           <w:szCs w:val="22"/>
         </w:rPr>
-        <w:t xml:space="preserve">While these models may achieve high classification accuracy, their reported </w:t>
-      </w:r>
-      <w:r>
-        <w:rPr>
-          <w:rFonts w:ascii="Garamond" w:hAnsi="Garamond"/>
-          <w:sz w:val="22"/>
-          <w:szCs w:val="22"/>
-        </w:rPr>
-        <w:t xml:space="preserve">probability </w:t>
-      </w:r>
-      <w:r>
-        <w:rPr>
-          <w:rFonts w:ascii="Garamond" w:hAnsi="Garamond"/>
-          <w:sz w:val="22"/>
-          <w:szCs w:val="22"/>
-        </w:rPr>
-        <w:t>scores</w:t>
-      </w:r>
-      <w:r>
-        <w:rPr>
-          <w:rFonts w:ascii="Garamond" w:hAnsi="Garamond"/>
-          <w:sz w:val="22"/>
-          <w:szCs w:val="22"/>
-        </w:rPr>
-        <w:t xml:space="preserve"> may not match the true proportion of correct classifications</w:t>
-      </w:r>
-      <w:r>
-        <w:rPr>
-          <w:rFonts w:ascii="Garamond" w:hAnsi="Garamond"/>
-          <w:sz w:val="22"/>
-          <w:szCs w:val="22"/>
-        </w:rPr>
-        <w:t xml:space="preserve"> associated with binned samples with that same probability value</w:t>
-      </w:r>
-      <w:r>
-        <w:rPr>
-          <w:rFonts w:ascii="Garamond" w:hAnsi="Garamond"/>
-          <w:sz w:val="22"/>
-          <w:szCs w:val="22"/>
-        </w:rPr>
-        <w:t xml:space="preserve">. </w:t>
-      </w:r>
-      <w:r>
-        <w:rPr>
-          <w:rFonts w:ascii="Garamond" w:hAnsi="Garamond"/>
-          <w:sz w:val="22"/>
-          <w:szCs w:val="22"/>
-        </w:rPr>
-        <w:t xml:space="preserve">Although these scores </w:t>
+        <w:t xml:space="preserve">To be treated as true confidence values, we should expect that the observed proportion of individuals belonging to a given class aligns with the model’s </w:t>
       </w:r>
       <w:r>
         <w:rPr>
@@ -8271,7 +8255,39 @@
           <w:szCs w:val="22"/>
         </w:rPr>
         <w:lastRenderedPageBreak/>
-        <w:t>provide sufficient class ranking, t</w:t>
+        <w:t xml:space="preserve">assigned probability for that class. For example, if </w:t>
+      </w:r>
+      <w:r>
+        <w:rPr>
+          <w:rFonts w:ascii="Garamond" w:hAnsi="Garamond"/>
+          <w:sz w:val="22"/>
+          <w:szCs w:val="22"/>
+        </w:rPr>
+        <w:t xml:space="preserve">our </w:t>
+      </w:r>
+      <w:r>
+        <w:rPr>
+          <w:rFonts w:ascii="Garamond" w:hAnsi="Garamond"/>
+          <w:sz w:val="22"/>
+          <w:szCs w:val="22"/>
+        </w:rPr>
+        <w:t>model predicts individuals to have originated from the Kuskokwim watershed with 80% probability, then approximately 80% of those individuals should in fact be Kuskokwim fish.</w:t>
+      </w:r>
+      <w:r>
+        <w:rPr>
+          <w:rFonts w:ascii="Garamond" w:hAnsi="Garamond"/>
+          <w:sz w:val="22"/>
+          <w:szCs w:val="22"/>
+        </w:rPr>
+        <w:t xml:space="preserve"> </w:t>
+      </w:r>
+      <w:r>
+        <w:rPr>
+          <w:rFonts w:ascii="Garamond" w:hAnsi="Garamond"/>
+          <w:sz w:val="22"/>
+          <w:szCs w:val="22"/>
+        </w:rPr>
+        <w:t>Although these scores provide sufficient class ranking, t</w:t>
       </w:r>
       <w:commentRangeStart w:id="12"/>
       <w:r>
@@ -8406,26 +8422,49 @@
           <w:rFonts w:ascii="Garamond" w:hAnsi="Garamond"/>
           <w:sz w:val="22"/>
           <w:szCs w:val="22"/>
-          <w:highlight w:val="yellow"/>
-        </w:rPr>
-        <w:t>(cite)</w:t>
-      </w:r>
-      <w:r>
-        <w:rPr>
-          <w:rFonts w:ascii="Garamond" w:hAnsi="Garamond"/>
-          <w:sz w:val="22"/>
-          <w:szCs w:val="22"/>
-          <w:highlight w:val="yellow"/>
-        </w:rPr>
-        <w:t>.</w:t>
-      </w:r>
-      <w:r>
-        <w:rPr>
-          <w:rFonts w:ascii="Garamond" w:hAnsi="Garamond"/>
-          <w:sz w:val="22"/>
-          <w:szCs w:val="22"/>
-        </w:rPr>
-        <w:t xml:space="preserve"> </w:t>
+        </w:rPr>
+        <w:fldChar w:fldCharType="begin"/>
+      </w:r>
+      <w:r>
+        <w:rPr>
+          <w:rFonts w:ascii="Garamond" w:hAnsi="Garamond"/>
+          <w:sz w:val="22"/>
+          <w:szCs w:val="22"/>
+        </w:rPr>
+        <w:instrText xml:space="preserve"> ADDIN ZOTERO_ITEM CSL_CITATION {"citationID":"FsUssuNw","properties":{"formattedCitation":"(Kuhn et al., 2025)","plainCitation":"(Kuhn et al., 2025)","noteIndex":0},"citationItems":[{"id":5932,"uris":["http://zotero.org/users/8421274/items/5T9KPPTV"],"itemData":{"id":5932,"type":"software","title":"probably: Tools for Post-Processing Predicted Values","URL":"https://github.com/tidymodels/probably","author":[{"family":"Kuhn","given":"Max"},{"family":"Vaughn","given":"Davis"},{"family":"Ruiz","given":"Edgar"}],"issued":{"date-parts":[["2025"]]}}}],"schema":"https://github.com/citation-style-language/schema/raw/master/csl-citation.json"} </w:instrText>
+      </w:r>
+      <w:r>
+        <w:rPr>
+          <w:rFonts w:ascii="Garamond" w:hAnsi="Garamond"/>
+          <w:sz w:val="22"/>
+          <w:szCs w:val="22"/>
+        </w:rPr>
+        <w:fldChar w:fldCharType="separate"/>
+      </w:r>
+      <w:r>
+        <w:rPr>
+          <w:rFonts w:ascii="Garamond" w:hAnsi="Garamond"/>
+          <w:noProof/>
+          <w:sz w:val="22"/>
+          <w:szCs w:val="22"/>
+        </w:rPr>
+        <w:t>(Kuhn et al., 2025)</w:t>
+      </w:r>
+      <w:r>
+        <w:rPr>
+          <w:rFonts w:ascii="Garamond" w:hAnsi="Garamond"/>
+          <w:sz w:val="22"/>
+          <w:szCs w:val="22"/>
+        </w:rPr>
+        <w:fldChar w:fldCharType="end"/>
+      </w:r>
+      <w:r>
+        <w:rPr>
+          <w:rFonts w:ascii="Garamond" w:hAnsi="Garamond"/>
+          <w:sz w:val="22"/>
+          <w:szCs w:val="22"/>
+        </w:rPr>
+        <w:t xml:space="preserve">. </w:t>
       </w:r>
       <w:commentRangeStart w:id="14"/>
       <w:commentRangeStart w:id="15"/>
@@ -8953,16 +8992,8 @@
           <w:sz w:val="22"/>
           <w:szCs w:val="22"/>
         </w:rPr>
-        <w:t xml:space="preserve">The pattern observed in the full dataset was also found among only individuals with the same natal origin value (0.7080 – 0.7085). The PCA results on this subset also displayed clustering by watershed, with a </w:t>
-      </w:r>
-      <w:r>
-        <w:rPr>
-          <w:rFonts w:ascii="Garamond" w:hAnsi="Garamond"/>
-          <w:sz w:val="22"/>
-          <w:szCs w:val="22"/>
-        </w:rPr>
         <w:lastRenderedPageBreak/>
-        <w:t xml:space="preserve">larger </w:t>
+        <w:t xml:space="preserve">The pattern observed in the full dataset was also found among only individuals with the same natal origin value (0.7080 – 0.7085). The PCA results on this subset also displayed clustering by watershed, with a larger </w:t>
       </w:r>
       <w:commentRangeStart w:id="16"/>
       <w:commentRangeStart w:id="17"/>
@@ -9763,7 +9794,16 @@
           <w:sz w:val="22"/>
           <w:szCs w:val="22"/>
         </w:rPr>
-        <w:t xml:space="preserve">In general, RF analysis outperformed both KNN and SVM, however, SVM was the highest performer on </w:t>
+        <w:t xml:space="preserve">In general, RF analysis outperformed both KNN and SVM, however, SVM was the </w:t>
+      </w:r>
+      <w:r>
+        <w:rPr>
+          <w:rFonts w:ascii="Garamond" w:hAnsi="Garamond"/>
+          <w:sz w:val="22"/>
+          <w:szCs w:val="22"/>
+        </w:rPr>
+        <w:lastRenderedPageBreak/>
+        <w:t xml:space="preserve">highest performer on </w:t>
       </w:r>
       <w:r>
         <w:rPr>
@@ -9827,16 +9867,7 @@
           <w:sz w:val="22"/>
           <w:szCs w:val="22"/>
         </w:rPr>
-        <w:t xml:space="preserve"> </w:t>
-      </w:r>
-      <w:r>
-        <w:rPr>
-          <w:rFonts w:ascii="Garamond" w:hAnsi="Garamond"/>
-          <w:sz w:val="22"/>
-          <w:szCs w:val="22"/>
-        </w:rPr>
-        <w:lastRenderedPageBreak/>
-        <w:t>t</w:t>
+        <w:t xml:space="preserve"> t</w:t>
       </w:r>
       <w:r>
         <w:rPr>
@@ -9901,14 +9932,6 @@
           <w:szCs w:val="22"/>
         </w:rPr>
         <w:t xml:space="preserve">restricted </w:t>
-      </w:r>
-      <w:commentRangeStart w:id="19"/>
-      <w:commentRangeEnd w:id="19"/>
-      <w:r>
-        <w:rPr>
-          <w:rStyle w:val="CommentReference"/>
-        </w:rPr>
-        <w:commentReference w:id="19"/>
       </w:r>
       <w:r>
         <w:rPr>
@@ -9953,7 +9976,7 @@
         </w:rPr>
         <w:t>forming model (RF, GAM-smoothed data) displayed some variation in overall accuracy among classes. On the Total testing set 92.0% of Kuskokwim, 91.4% of Nushagak, and 93.7% of Yukon samples were correctly identified (</w:t>
       </w:r>
-      <w:commentRangeStart w:id="20"/>
+      <w:commentRangeStart w:id="19"/>
       <w:r>
         <w:rPr>
           <w:rFonts w:ascii="Garamond" w:hAnsi="Garamond"/>
@@ -9962,12 +9985,12 @@
         </w:rPr>
         <w:t>Figure</w:t>
       </w:r>
-      <w:commentRangeEnd w:id="20"/>
+      <w:commentRangeEnd w:id="19"/>
       <w:r>
         <w:rPr>
           <w:rStyle w:val="CommentReference"/>
         </w:rPr>
-        <w:commentReference w:id="20"/>
+        <w:commentReference w:id="19"/>
       </w:r>
       <w:r>
         <w:rPr>
@@ -10275,43 +10298,75 @@
           <w:rFonts w:ascii="Garamond" w:hAnsi="Garamond"/>
           <w:sz w:val="22"/>
           <w:szCs w:val="22"/>
+          <w:highlight w:val="yellow"/>
+        </w:rPr>
+        <w:t>.</w:t>
+      </w:r>
+      <w:r>
+        <w:rPr>
+          <w:rFonts w:ascii="Garamond" w:hAnsi="Garamond"/>
+          <w:sz w:val="22"/>
+          <w:szCs w:val="22"/>
+        </w:rPr>
+        <w:t xml:space="preserve"> Visual assessments indicated improved calibration, with the relationship between predicted and observed </w:t>
+      </w:r>
+      <w:r>
+        <w:rPr>
+          <w:rFonts w:ascii="Garamond" w:hAnsi="Garamond"/>
+          <w:sz w:val="22"/>
+          <w:szCs w:val="22"/>
+        </w:rPr>
+        <w:lastRenderedPageBreak/>
+        <w:t>probabilities approximating a 1:1 line across all classes and model–data type combinations</w:t>
+      </w:r>
+      <w:r>
+        <w:rPr>
+          <w:rFonts w:ascii="Garamond" w:hAnsi="Garamond"/>
+          <w:sz w:val="22"/>
+          <w:szCs w:val="22"/>
+        </w:rPr>
+        <w:t xml:space="preserve"> (ex. </w:t>
+      </w:r>
+      <w:commentRangeStart w:id="20"/>
+      <w:r>
+        <w:rPr>
+          <w:rFonts w:ascii="Garamond" w:hAnsi="Garamond"/>
+          <w:sz w:val="22"/>
+          <w:szCs w:val="22"/>
+        </w:rPr>
+        <w:t>Supp</w:t>
+      </w:r>
+      <w:commentRangeEnd w:id="20"/>
+      <w:r>
+        <w:rPr>
+          <w:rStyle w:val="CommentReference"/>
+        </w:rPr>
+        <w:commentReference w:id="20"/>
+      </w:r>
+      <w:r>
+        <w:rPr>
+          <w:rFonts w:ascii="Garamond" w:hAnsi="Garamond"/>
+          <w:sz w:val="22"/>
+          <w:szCs w:val="22"/>
+        </w:rPr>
+        <w:t xml:space="preserve">. Fig 1) </w:t>
+      </w:r>
+      <w:r>
+        <w:rPr>
+          <w:rFonts w:ascii="Garamond" w:hAnsi="Garamond"/>
+          <w:sz w:val="22"/>
+          <w:szCs w:val="22"/>
+        </w:rPr>
+        <w:t>.</w:t>
+      </w:r>
+      <w:r>
+        <w:rPr>
+          <w:rFonts w:ascii="Garamond" w:hAnsi="Garamond"/>
+          <w:sz w:val="22"/>
+          <w:szCs w:val="22"/>
         </w:rPr>
         <w:t xml:space="preserve"> </w:t>
       </w:r>
-      <w:r>
-        <w:rPr>
-          <w:rFonts w:ascii="Garamond" w:hAnsi="Garamond"/>
-          <w:sz w:val="22"/>
-          <w:szCs w:val="22"/>
-          <w:highlight w:val="yellow"/>
-        </w:rPr>
-        <w:t>(cite)</w:t>
-      </w:r>
-      <w:r>
-        <w:rPr>
-          <w:rFonts w:ascii="Garamond" w:hAnsi="Garamond"/>
-          <w:sz w:val="22"/>
-          <w:szCs w:val="22"/>
-          <w:highlight w:val="yellow"/>
-        </w:rPr>
-        <w:t>.</w:t>
-      </w:r>
-      <w:r>
-        <w:rPr>
-          <w:rFonts w:ascii="Garamond" w:hAnsi="Garamond"/>
-          <w:sz w:val="22"/>
-          <w:szCs w:val="22"/>
-        </w:rPr>
-        <w:t xml:space="preserve"> Visual assessments indicated improved calibration, with the relationship between predicted and observed probabilities approximating a 1:1 line across all classes and model–data type combinations</w:t>
-      </w:r>
-      <w:r>
-        <w:rPr>
-          <w:rFonts w:ascii="Garamond" w:hAnsi="Garamond"/>
-          <w:sz w:val="22"/>
-          <w:szCs w:val="22"/>
-        </w:rPr>
-        <w:t xml:space="preserve"> (ex. </w:t>
-      </w:r>
       <w:commentRangeStart w:id="21"/>
       <w:r>
         <w:rPr>
@@ -10319,7 +10374,23 @@
           <w:sz w:val="22"/>
           <w:szCs w:val="22"/>
         </w:rPr>
-        <w:t>Supp</w:t>
+        <w:t xml:space="preserve">Across the range of tested thresholds, overall accuracy ranged from 91 – 79% for the total testing set and from 89.5% to 78% for the </w:t>
+      </w:r>
+      <w:r>
+        <w:rPr>
+          <w:rFonts w:ascii="Garamond" w:hAnsi="Garamond"/>
+          <w:sz w:val="22"/>
+          <w:szCs w:val="22"/>
+        </w:rPr>
+        <w:t>restricted</w:t>
+      </w:r>
+      <w:r>
+        <w:rPr>
+          <w:rFonts w:ascii="Garamond" w:hAnsi="Garamond"/>
+          <w:sz w:val="22"/>
+          <w:szCs w:val="22"/>
+        </w:rPr>
+        <w:t xml:space="preserve"> dataset</w:t>
       </w:r>
       <w:commentRangeEnd w:id="21"/>
       <w:r>
@@ -10327,71 +10398,6 @@
           <w:rStyle w:val="CommentReference"/>
         </w:rPr>
         <w:commentReference w:id="21"/>
-      </w:r>
-      <w:r>
-        <w:rPr>
-          <w:rFonts w:ascii="Garamond" w:hAnsi="Garamond"/>
-          <w:sz w:val="22"/>
-          <w:szCs w:val="22"/>
-        </w:rPr>
-        <w:t xml:space="preserve">. Fig 1) </w:t>
-      </w:r>
-      <w:r>
-        <w:rPr>
-          <w:rFonts w:ascii="Garamond" w:hAnsi="Garamond"/>
-          <w:sz w:val="22"/>
-          <w:szCs w:val="22"/>
-        </w:rPr>
-        <w:t>.</w:t>
-      </w:r>
-      <w:r>
-        <w:rPr>
-          <w:rFonts w:ascii="Garamond" w:hAnsi="Garamond"/>
-          <w:sz w:val="22"/>
-          <w:szCs w:val="22"/>
-        </w:rPr>
-        <w:t xml:space="preserve"> </w:t>
-      </w:r>
-      <w:commentRangeStart w:id="22"/>
-      <w:r>
-        <w:rPr>
-          <w:rFonts w:ascii="Garamond" w:hAnsi="Garamond"/>
-          <w:sz w:val="22"/>
-          <w:szCs w:val="22"/>
-        </w:rPr>
-        <w:t xml:space="preserve">Across the range of tested thresholds, overall accuracy ranged from 91 – 79% for the total testing set and </w:t>
-      </w:r>
-      <w:r>
-        <w:rPr>
-          <w:rFonts w:ascii="Garamond" w:hAnsi="Garamond"/>
-          <w:sz w:val="22"/>
-          <w:szCs w:val="22"/>
-        </w:rPr>
-        <w:lastRenderedPageBreak/>
-        <w:t xml:space="preserve">from 89.5% to 78% for the </w:t>
-      </w:r>
-      <w:r>
-        <w:rPr>
-          <w:rFonts w:ascii="Garamond" w:hAnsi="Garamond"/>
-          <w:sz w:val="22"/>
-          <w:szCs w:val="22"/>
-        </w:rPr>
-        <w:t>restricted</w:t>
-      </w:r>
-      <w:r>
-        <w:rPr>
-          <w:rFonts w:ascii="Garamond" w:hAnsi="Garamond"/>
-          <w:sz w:val="22"/>
-          <w:szCs w:val="22"/>
-        </w:rPr>
-        <w:t xml:space="preserve"> dataset</w:t>
-      </w:r>
-      <w:commentRangeEnd w:id="22"/>
-      <w:r>
-        <w:rPr>
-          <w:rStyle w:val="CommentReference"/>
-        </w:rPr>
-        <w:commentReference w:id="22"/>
       </w:r>
       <w:r>
         <w:rPr>
@@ -10696,7 +10702,7 @@
         </w:rPr>
         <w:t xml:space="preserve"> smoothing techniques significantly outperformed raw laser ablation data. </w:t>
       </w:r>
-      <w:commentRangeStart w:id="23"/>
+      <w:commentRangeStart w:id="22"/>
       <w:r>
         <w:rPr>
           <w:rFonts w:ascii="Garamond" w:hAnsi="Garamond"/>
@@ -10875,12 +10881,12 @@
         </w:rPr>
         <w:t xml:space="preserve">. </w:t>
       </w:r>
-      <w:commentRangeEnd w:id="23"/>
+      <w:commentRangeEnd w:id="22"/>
       <w:r>
         <w:rPr>
           <w:rStyle w:val="CommentReference"/>
         </w:rPr>
-        <w:commentReference w:id="23"/>
+        <w:commentReference w:id="22"/>
       </w:r>
     </w:p>
     <w:p>
@@ -10979,7 +10985,16 @@
           <w:sz w:val="22"/>
           <w:szCs w:val="22"/>
         </w:rPr>
-        <w:t xml:space="preserve"> 90% for all three watersheds. Most misclassifications occurred between Nushagak and Kuskokwim fish, consistent with expectations given the greater overlap in </w:t>
+        <w:t xml:space="preserve"> 90% for all three watersheds. Most misclassifications occurred between Nushagak and </w:t>
+      </w:r>
+      <w:r>
+        <w:rPr>
+          <w:rFonts w:ascii="Garamond" w:hAnsi="Garamond"/>
+          <w:sz w:val="22"/>
+          <w:szCs w:val="22"/>
+        </w:rPr>
+        <w:lastRenderedPageBreak/>
+        <w:t xml:space="preserve">Kuskokwim fish, consistent with expectations given the greater overlap in </w:t>
       </w:r>
       <w:r>
         <w:rPr>
@@ -11051,7 +11066,6 @@
           <w:sz w:val="22"/>
           <w:szCs w:val="22"/>
         </w:rPr>
-        <w:lastRenderedPageBreak/>
         <w:t xml:space="preserve">unique </w:t>
       </w:r>
       <w:r>
@@ -11673,42 +11687,47 @@
           <w:rFonts w:ascii="Garamond" w:hAnsi="Garamond"/>
           <w:sz w:val="22"/>
           <w:szCs w:val="22"/>
-          <w:highlight w:val="yellow"/>
-        </w:rPr>
-        <w:t xml:space="preserve">(Makhlouf et al., </w:t>
-      </w:r>
-      <w:commentRangeStart w:id="24"/>
-      <w:r>
-        <w:rPr>
-          <w:rFonts w:ascii="Garamond" w:hAnsi="Garamond"/>
-          <w:sz w:val="22"/>
-          <w:szCs w:val="22"/>
-          <w:highlight w:val="yellow"/>
-        </w:rPr>
-        <w:t>2025</w:t>
-      </w:r>
-      <w:commentRangeEnd w:id="24"/>
-      <w:r>
-        <w:rPr>
-          <w:rStyle w:val="CommentReference"/>
-        </w:rPr>
-        <w:commentReference w:id="24"/>
-      </w:r>
-      <w:r>
-        <w:rPr>
-          <w:rFonts w:ascii="Garamond" w:hAnsi="Garamond"/>
-          <w:sz w:val="22"/>
-          <w:szCs w:val="22"/>
-          <w:highlight w:val="yellow"/>
-        </w:rPr>
-        <w:t>)</w:t>
-      </w:r>
-      <w:r>
-        <w:rPr>
-          <w:rFonts w:ascii="Garamond" w:hAnsi="Garamond"/>
-          <w:sz w:val="22"/>
-          <w:szCs w:val="22"/>
-          <w:highlight w:val="yellow"/>
+        </w:rPr>
+        <w:fldChar w:fldCharType="begin"/>
+      </w:r>
+      <w:r>
+        <w:rPr>
+          <w:rFonts w:ascii="Garamond" w:hAnsi="Garamond"/>
+          <w:sz w:val="22"/>
+          <w:szCs w:val="22"/>
+        </w:rPr>
+        <w:instrText xml:space="preserve"> ADDIN ZOTERO_ITEM CSL_CITATION {"citationID":"6mD2W5BR","properties":{"formattedCitation":"(Makhlouf et al., 2025)","plainCitation":"(Makhlouf et al., 2025)","noteIndex":0},"citationItems":[{"id":5397,"uris":["http://zotero.org/users/8421274/items/WRVF2L9N"],"itemData":{"id":5397,"type":"article-journal","abstract":"Understanding the spatial ecology of migratory species is uniquely challenging using conventional approaches. In fisheries such as for Pacific salmon, genetic stock identification (GSI) and isotope-based methods have emerged as strategies for reconstructing spatial ecology but are limited by the spatial resolution of genetic differentiation and isotopic heterogeneity. We show that integrating these complementary datasets improve the spatial resolution of provenance assignments. To do so, we reconstructed basin-wide estimates of natal origin locations for Chinook salmon in the Yukon River using samples (n = 247) from an experimental fishery designed to assess in-season run timing. A combined framework improved precision of likely provenance assignments (stream km &gt; 0.7 posterior probability) by 92% over genetic assignments and 52% over strontium isotope methods. In doing so, we illustrate watershed scale estimates of natal origin distributions with a greater resolution available from GSI or isotope data alone.","container-title":"Limnology and Oceanography Letters","DOI":"10.1002/lol2.70025","ISSN":"2378-2242","issue":"n/a","language":"en","license":"© 2025 The Author(s). Limnology and Oceanography Letters published by Wiley Periodicals LLC on behalf of Association for the Sciences of Limnology and Oceanography.","note":"_eprint: https://onlinelibrary.wiley.com/doi/pdf/10.1002/lol2.70025","source":"Wiley Online Library","title":"Combining genetic and isotope frameworks improves reconstruction of fish provenance across riverscapes","URL":"https://onlinelibrary.wiley.com/doi/abs/10.1002/lol2.70025","volume":"n/a","author":[{"family":"Makhlouf","given":"Ben"},{"family":"Cline","given":"Timothy J."},{"family":"Fernandez","given":"Diego"},{"family":"Seeb","given":"Lisa"},{"family":"Lee","given":"Elizabeth"},{"family":"Gilk-Baumer","given":"Sara"},{"family":"Whited","given":"Diane"},{"family":"Zimmerman","given":"Christian E."},{"family":"Schindler","given":"Daniel E."}],"accessed":{"date-parts":[["2025",6,4]]},"issued":{"date-parts":[["2025"]]}}}],"schema":"https://github.com/citation-style-language/schema/raw/master/csl-citation.json"} </w:instrText>
+      </w:r>
+      <w:r>
+        <w:rPr>
+          <w:rFonts w:ascii="Garamond" w:hAnsi="Garamond"/>
+          <w:sz w:val="22"/>
+          <w:szCs w:val="22"/>
+        </w:rPr>
+        <w:fldChar w:fldCharType="separate"/>
+      </w:r>
+      <w:r>
+        <w:rPr>
+          <w:rFonts w:ascii="Garamond" w:hAnsi="Garamond"/>
+          <w:noProof/>
+          <w:sz w:val="22"/>
+          <w:szCs w:val="22"/>
+        </w:rPr>
+        <w:t>(Makhlouf et al., 2025)</w:t>
+      </w:r>
+      <w:r>
+        <w:rPr>
+          <w:rFonts w:ascii="Garamond" w:hAnsi="Garamond"/>
+          <w:sz w:val="22"/>
+          <w:szCs w:val="22"/>
+        </w:rPr>
+        <w:fldChar w:fldCharType="end"/>
+      </w:r>
+      <w:r>
+        <w:rPr>
+          <w:rFonts w:ascii="Garamond" w:hAnsi="Garamond"/>
+          <w:sz w:val="22"/>
+          <w:szCs w:val="22"/>
         </w:rPr>
         <w:t>.</w:t>
       </w:r>
@@ -11718,7 +11737,15 @@
           <w:sz w:val="22"/>
           <w:szCs w:val="22"/>
         </w:rPr>
-        <w:t xml:space="preserve"> However, these preliminary observations suggest that similar approaches to the one outlined here may have the potential to improve assignment precision to the sub-basin scale without the need for additional data sources. </w:t>
+        <w:t xml:space="preserve"> </w:t>
+      </w:r>
+      <w:r>
+        <w:rPr>
+          <w:rFonts w:ascii="Garamond" w:hAnsi="Garamond"/>
+          <w:sz w:val="22"/>
+          <w:szCs w:val="22"/>
+        </w:rPr>
+        <w:t xml:space="preserve">However, these preliminary observations suggest that similar approaches to the one outlined here may have the potential to improve assignment precision to the sub-basin scale without the need for additional data sources. </w:t>
       </w:r>
     </w:p>
     <w:p>
@@ -11767,7 +11794,6 @@
           <w:sz w:val="22"/>
           <w:szCs w:val="22"/>
         </w:rPr>
-        <w:lastRenderedPageBreak/>
         <w:t xml:space="preserve">A tool to estimate provenance of marine-caught Chinook salmon in </w:t>
       </w:r>
       <w:r>
@@ -12199,7 +12225,16 @@
           <w:sz w:val="22"/>
           <w:szCs w:val="22"/>
         </w:rPr>
-        <w:t xml:space="preserve">model uncertainty. In addition, these values can be </w:t>
+        <w:t xml:space="preserve">model uncertainty. In addition, </w:t>
+      </w:r>
+      <w:r>
+        <w:rPr>
+          <w:rFonts w:ascii="Garamond" w:hAnsi="Garamond"/>
+          <w:sz w:val="22"/>
+          <w:szCs w:val="22"/>
+        </w:rPr>
+        <w:lastRenderedPageBreak/>
+        <w:t xml:space="preserve">these values can be </w:t>
       </w:r>
       <w:r>
         <w:rPr>
@@ -12282,7 +12317,6 @@
           <w:sz w:val="22"/>
           <w:szCs w:val="22"/>
         </w:rPr>
-        <w:lastRenderedPageBreak/>
         <w:tab/>
       </w:r>
       <w:r>
@@ -12575,14 +12609,6 @@
           <w:szCs w:val="22"/>
         </w:rPr>
       </w:pPr>
-      <w:r>
-        <w:rPr>
-          <w:rFonts w:ascii="Garamond" w:hAnsi="Garamond"/>
-          <w:sz w:val="22"/>
-          <w:szCs w:val="22"/>
-        </w:rPr>
-        <w:t xml:space="preserve">Acknowledgements: </w:t>
-      </w:r>
     </w:p>
     <w:p>
       <w:pPr>
@@ -12590,6 +12616,8 @@
         <w:outlineLvl w:val="1"/>
         <w:rPr>
           <w:rFonts w:ascii="Garamond" w:hAnsi="Garamond"/>
+          <w:b/>
+          <w:bCs/>
           <w:sz w:val="22"/>
           <w:szCs w:val="22"/>
         </w:rPr>
@@ -12597,37 +12625,102 @@
       <w:r>
         <w:rPr>
           <w:rFonts w:ascii="Garamond" w:hAnsi="Garamond"/>
-          <w:sz w:val="22"/>
-          <w:szCs w:val="22"/>
-        </w:rPr>
-        <w:t xml:space="preserve">Arctic-Yukon-Kuskokwim Sustainable Salmon Initiative and the Kuskokwim River Intertribal Fish </w:t>
-      </w:r>
-      <w:proofErr w:type="gramStart"/>
-      <w:r>
-        <w:rPr>
-          <w:rFonts w:ascii="Garamond" w:hAnsi="Garamond"/>
-          <w:sz w:val="22"/>
-          <w:szCs w:val="22"/>
-        </w:rPr>
-        <w:t xml:space="preserve">Commission </w:t>
-      </w:r>
-      <w:r>
-        <w:rPr>
-          <w:rFonts w:ascii="Garamond" w:hAnsi="Garamond"/>
-          <w:sz w:val="22"/>
-          <w:szCs w:val="22"/>
-        </w:rPr>
-        <w:t>,</w:t>
-      </w:r>
-      <w:proofErr w:type="gramEnd"/>
-      <w:r>
-        <w:rPr>
-          <w:rFonts w:ascii="Garamond" w:hAnsi="Garamond"/>
-          <w:sz w:val="22"/>
-          <w:szCs w:val="22"/>
-        </w:rPr>
-        <w:t xml:space="preserve"> Sean. </w:t>
-      </w:r>
+          <w:b/>
+          <w:bCs/>
+          <w:sz w:val="22"/>
+          <w:szCs w:val="22"/>
+        </w:rPr>
+        <w:lastRenderedPageBreak/>
+        <w:t xml:space="preserve">Acknowledgements: </w:t>
+      </w:r>
+    </w:p>
+    <w:p>
+      <w:pPr>
+        <w:spacing w:before="100" w:beforeAutospacing="1" w:after="100" w:afterAutospacing="1" w:line="480" w:lineRule="auto"/>
+        <w:outlineLvl w:val="1"/>
+        <w:rPr>
+          <w:rFonts w:ascii="Garamond" w:hAnsi="Garamond"/>
+          <w:sz w:val="22"/>
+          <w:szCs w:val="22"/>
+        </w:rPr>
+      </w:pPr>
+      <w:r>
+        <w:rPr>
+          <w:rFonts w:ascii="Garamond" w:hAnsi="Garamond"/>
+          <w:sz w:val="22"/>
+          <w:szCs w:val="22"/>
+        </w:rPr>
+        <w:t xml:space="preserve">This work is not possible without the efforts of Dr. Sean Brennan, who collected the data used in this study and worked tirelessly to </w:t>
+      </w:r>
+      <w:r>
+        <w:rPr>
+          <w:rFonts w:ascii="Garamond" w:hAnsi="Garamond"/>
+          <w:sz w:val="22"/>
+          <w:szCs w:val="22"/>
+        </w:rPr>
+        <w:t xml:space="preserve">advance isotope-based research related to pacific salmon. </w:t>
+      </w:r>
+      <w:r>
+        <w:rPr>
+          <w:rFonts w:ascii="Garamond" w:hAnsi="Garamond"/>
+          <w:sz w:val="22"/>
+          <w:szCs w:val="22"/>
+        </w:rPr>
+        <w:t xml:space="preserve">We thank the </w:t>
+      </w:r>
+      <w:r>
+        <w:rPr>
+          <w:rFonts w:ascii="Garamond" w:hAnsi="Garamond"/>
+          <w:sz w:val="22"/>
+          <w:szCs w:val="22"/>
+        </w:rPr>
+        <w:t xml:space="preserve">efforts of Alaska department of fish and game, ONC, and Bethel test fishery for aiding in sample collection over several years, and for the employees of the Alaska Department of Fish and Game gene </w:t>
+      </w:r>
+      <w:proofErr w:type="spellStart"/>
+      <w:r>
+        <w:rPr>
+          <w:rFonts w:ascii="Garamond" w:hAnsi="Garamond"/>
+          <w:sz w:val="22"/>
+          <w:szCs w:val="22"/>
+        </w:rPr>
+        <w:t>convservation</w:t>
+      </w:r>
+      <w:proofErr w:type="spellEnd"/>
+      <w:r>
+        <w:rPr>
+          <w:rFonts w:ascii="Garamond" w:hAnsi="Garamond"/>
+          <w:sz w:val="22"/>
+          <w:szCs w:val="22"/>
+        </w:rPr>
+        <w:t xml:space="preserve"> lab who provided the genetics data for this study. This work is supported by the </w:t>
+      </w:r>
+      <w:r>
+        <w:rPr>
+          <w:rFonts w:ascii="Garamond" w:hAnsi="Garamond"/>
+          <w:sz w:val="22"/>
+          <w:szCs w:val="22"/>
+        </w:rPr>
+        <w:t xml:space="preserve">Arctic Yukon Kuskokwim (AYK) Sustainable Salmon Initiative as well as the Kuskokwim River intertribal fish commission </w:t>
+      </w:r>
+      <w:r>
+        <w:rPr>
+          <w:rFonts w:ascii="Garamond" w:hAnsi="Garamond"/>
+          <w:sz w:val="22"/>
+          <w:szCs w:val="22"/>
+        </w:rPr>
+        <w:t xml:space="preserve">(KRITFC). </w:t>
+      </w:r>
+    </w:p>
+    <w:p>
+      <w:pPr>
+        <w:spacing w:before="100" w:beforeAutospacing="1" w:after="100" w:afterAutospacing="1" w:line="480" w:lineRule="auto"/>
+        <w:outlineLvl w:val="1"/>
+        <w:rPr>
+          <w:rFonts w:ascii="Garamond" w:hAnsi="Garamond"/>
+          <w:sz w:val="22"/>
+          <w:szCs w:val="22"/>
+        </w:rPr>
+      </w:pPr>
     </w:p>
     <w:sectPr>
       <w:pgSz w:w="12240" w:h="15840"/>
@@ -12967,11 +13060,11 @@
         <w:annotationRef/>
       </w:r>
       <w:r>
-        <w:t>I wonder if this is better called as the ‘restricted’ dataset?</w:t>
+        <w:t>Figure order….</w:t>
       </w:r>
     </w:p>
   </w:comment>
-  <w:comment w:id="20" w:author="Daniel Schindler" w:date="2025-10-25T11:23:00Z" w:initials="DS">
+  <w:comment w:id="20" w:author="Daniel Schindler" w:date="2025-10-25T11:25:00Z" w:initials="DS">
     <w:p>
       <w:pPr>
         <w:pStyle w:val="CommentText"/>
@@ -12983,15 +13076,12 @@
         <w:annotationRef/>
       </w:r>
       <w:r>
-        <w:t>Figure order….</w:t>
+        <w:t>Have to say I didn’t understand this so it should probably be descrivbed in a little more detail in the Supplement.</w:t>
       </w:r>
     </w:p>
   </w:comment>
-  <w:comment w:id="21" w:author="Daniel Schindler" w:date="2025-10-25T11:25:00Z" w:initials="DS">
+  <w:comment w:id="21" w:author="Valentina M. Staneva" w:date="2025-09-29T10:51:00Z" w:initials="VMS">
     <w:p>
-      <w:pPr>
-        <w:pStyle w:val="CommentText"/>
-      </w:pPr>
       <w:r>
         <w:rPr>
           <w:rStyle w:val="CommentReference"/>
@@ -12999,11 +13089,15 @@
         <w:annotationRef/>
       </w:r>
       <w:r>
-        <w:t>Have to say I didn’t understand this so it should probably be descrivbed in a little more detail in the Supplement.</w:t>
+        <w:rPr>
+          <w:sz w:val="20"/>
+          <w:szCs w:val="20"/>
+        </w:rPr>
+        <w:t>Is this after calibration?</w:t>
       </w:r>
     </w:p>
   </w:comment>
-  <w:comment w:id="22" w:author="Valentina M. Staneva" w:date="2025-09-29T10:51:00Z" w:initials="VMS">
+  <w:comment w:id="22" w:author="Valentina M. Staneva" w:date="2025-09-28T16:25:00Z" w:initials="VMS">
     <w:p>
       <w:r>
         <w:rPr>
@@ -13016,41 +13110,7 @@
           <w:sz w:val="20"/>
           <w:szCs w:val="20"/>
         </w:rPr>
-        <w:t>Is this after calibration?</w:t>
-      </w:r>
-    </w:p>
-  </w:comment>
-  <w:comment w:id="23" w:author="Valentina M. Staneva" w:date="2025-09-28T16:25:00Z" w:initials="VMS">
-    <w:p>
-      <w:r>
-        <w:rPr>
-          <w:rStyle w:val="CommentReference"/>
-        </w:rPr>
-        <w:annotationRef/>
-      </w:r>
-      <w:r>
-        <w:rPr>
-          <w:sz w:val="20"/>
-          <w:szCs w:val="20"/>
-        </w:rPr>
         <w:t>language regarding time-series analysis techniques</w:t>
-      </w:r>
-    </w:p>
-  </w:comment>
-  <w:comment w:id="24" w:author="bmak29" w:date="2025-10-27T08:54:00Z" w:initials="b">
-    <w:p>
-      <w:r>
-        <w:rPr>
-          <w:rStyle w:val="CommentReference"/>
-        </w:rPr>
-        <w:annotationRef/>
-      </w:r>
-      <w:r>
-        <w:rPr>
-          <w:sz w:val="20"/>
-          <w:szCs w:val="20"/>
-        </w:rPr>
-        <w:t>Add cite</w:t>
       </w:r>
     </w:p>
   </w:comment>
@@ -13073,17 +13133,15 @@
   <w15:commentEx w15:paraId="709A2CCE" w15:done="1"/>
   <w15:commentEx w15:paraId="3471AB53" w15:done="1"/>
   <w15:commentEx w15:paraId="0D12D82A" w15:done="1"/>
-  <w15:commentEx w15:paraId="148A0BEE" w15:done="0"/>
-  <w15:commentEx w15:paraId="55BD51FF" w15:paraIdParent="148A0BEE" w15:done="0"/>
+  <w15:commentEx w15:paraId="148A0BEE" w15:done="1"/>
+  <w15:commentEx w15:paraId="55BD51FF" w15:paraIdParent="148A0BEE" w15:done="1"/>
   <w15:commentEx w15:paraId="675A943E" w15:done="0"/>
   <w15:commentEx w15:paraId="2049A98D" w15:paraIdParent="675A943E" w15:done="0"/>
   <w15:commentEx w15:paraId="50EEEBDC" w15:done="1"/>
-  <w15:commentEx w15:paraId="01743871" w15:done="0"/>
-  <w15:commentEx w15:paraId="7EC890DE" w15:done="0"/>
+  <w15:commentEx w15:paraId="7EC890DE" w15:done="1"/>
   <w15:commentEx w15:paraId="55B434CA" w15:done="0"/>
   <w15:commentEx w15:paraId="00A06E06" w15:done="1"/>
   <w15:commentEx w15:paraId="31E84DFE" w15:done="1"/>
-  <w15:commentEx w15:paraId="42FC3DA8" w15:done="0"/>
 </w15:commentsEx>
 </file>
 
@@ -13108,12 +13166,10 @@
   <w16cex:commentExtensible w16cex:durableId="225D921D" w16cex:dateUtc="2025-10-25T18:20:00Z"/>
   <w16cex:commentExtensible w16cex:durableId="0FBE3D6B" w16cex:dateUtc="2025-10-27T12:40:00Z"/>
   <w16cex:commentExtensible w16cex:durableId="779C829C" w16cex:dateUtc="2025-10-25T18:21:00Z"/>
-  <w16cex:commentExtensible w16cex:durableId="6BBF07F3" w16cex:dateUtc="2025-10-25T18:23:00Z"/>
   <w16cex:commentExtensible w16cex:durableId="25773A8B" w16cex:dateUtc="2025-10-25T18:23:00Z"/>
   <w16cex:commentExtensible w16cex:durableId="4C23A7C7" w16cex:dateUtc="2025-10-25T18:25:00Z"/>
   <w16cex:commentExtensible w16cex:durableId="37956EA5" w16cex:dateUtc="2025-09-29T17:51:00Z"/>
   <w16cex:commentExtensible w16cex:durableId="7B5EF19A" w16cex:dateUtc="2025-09-28T23:25:00Z"/>
-  <w16cex:commentExtensible w16cex:durableId="05785BBC" w16cex:dateUtc="2025-10-27T12:54:00Z"/>
 </w16cex:commentsExtensible>
 </file>
 
@@ -13138,12 +13194,10 @@
   <w16cid:commentId w16cid:paraId="675A943E" w16cid:durableId="225D921D"/>
   <w16cid:commentId w16cid:paraId="2049A98D" w16cid:durableId="0FBE3D6B"/>
   <w16cid:commentId w16cid:paraId="50EEEBDC" w16cid:durableId="779C829C"/>
-  <w16cid:commentId w16cid:paraId="01743871" w16cid:durableId="6BBF07F3"/>
   <w16cid:commentId w16cid:paraId="7EC890DE" w16cid:durableId="25773A8B"/>
   <w16cid:commentId w16cid:paraId="55B434CA" w16cid:durableId="4C23A7C7"/>
   <w16cid:commentId w16cid:paraId="00A06E06" w16cid:durableId="37956EA5"/>
   <w16cid:commentId w16cid:paraId="31E84DFE" w16cid:durableId="7B5EF19A"/>
-  <w16cid:commentId w16cid:paraId="42FC3DA8" w16cid:durableId="05785BBC"/>
 </w16cid:commentsIds>
 </file>
 

</xml_diff>